<commit_message>
docs: incluir diagramas en avance y version Word
</commit_message>
<xml_diff>
--- a/docs/AVANCE.docx
+++ b/docs/AVANCE.docx
@@ -1,6 +1,6 @@
 
 <file path=word/document.xml><?xml version="1.0" encoding="utf-8"?>
-<w:document xmlns:w="http://schemas.openxmlformats.org/wordprocessingml/2006/main">
+<w:document xmlns:w="http://schemas.openxmlformats.org/wordprocessingml/2006/main" xmlns:r="http://schemas.openxmlformats.org/officeDocument/2006/relationships" xmlns:wp="http://schemas.openxmlformats.org/drawingml/2006/wordprocessingDrawing" xmlns:a="http://schemas.openxmlformats.org/drawingml/2006/main" xmlns:pic="http://schemas.openxmlformats.org/drawingml/2006/picture">
   <w:body>
     <w:p>
       <w:pPr>
@@ -17,7 +17,7 @@
     <w:p/>
     <w:p>
       <w:pPr>
-        <w:spacing w:after="80"/>
+        <w:spacing w:after="120"/>
       </w:pPr>
       <w:r>
         <w:rPr>
@@ -145,7 +145,7 @@
     <w:p/>
     <w:p>
       <w:pPr>
-        <w:spacing w:after="80"/>
+        <w:spacing w:after="120"/>
       </w:pPr>
       <w:r>
         <w:rPr>
@@ -194,7 +194,7 @@
     <w:p/>
     <w:p>
       <w:pPr>
-        <w:spacing w:after="80"/>
+        <w:spacing w:after="120"/>
       </w:pPr>
       <w:r>
         <w:rPr>
@@ -225,7 +225,7 @@
     <w:p/>
     <w:p>
       <w:pPr>
-        <w:spacing w:after="60"/>
+        <w:spacing w:after="120"/>
       </w:pPr>
       <w:r>
         <w:rPr>
@@ -250,7 +250,7 @@
     <w:p/>
     <w:p>
       <w:pPr>
-        <w:spacing w:after="80"/>
+        <w:spacing w:after="120"/>
       </w:pPr>
       <w:r>
         <w:rPr>
@@ -263,7 +263,7 @@
     <w:p/>
     <w:p>
       <w:pPr>
-        <w:spacing w:after="60"/>
+        <w:spacing w:after="120"/>
       </w:pPr>
       <w:r>
         <w:rPr>
@@ -323,7 +323,7 @@
     <w:p/>
     <w:p>
       <w:pPr>
-        <w:spacing w:after="60"/>
+        <w:spacing w:after="120"/>
       </w:pPr>
       <w:r>
         <w:rPr>
@@ -368,7 +368,7 @@
     <w:p/>
     <w:p>
       <w:pPr>
-        <w:spacing w:after="60"/>
+        <w:spacing w:after="120"/>
       </w:pPr>
       <w:r>
         <w:rPr>
@@ -393,7 +393,7 @@
     <w:p/>
     <w:p>
       <w:pPr>
-        <w:spacing w:after="80"/>
+        <w:spacing w:after="120"/>
       </w:pPr>
       <w:r>
         <w:rPr>
@@ -442,7 +442,7 @@
     <w:p/>
     <w:p>
       <w:pPr>
-        <w:spacing w:after="80"/>
+        <w:spacing w:after="120"/>
       </w:pPr>
       <w:r>
         <w:rPr>
@@ -455,7 +455,7 @@
     <w:p/>
     <w:p>
       <w:pPr>
-        <w:spacing w:after="60"/>
+        <w:spacing w:after="120"/>
       </w:pPr>
       <w:r>
         <w:rPr>
@@ -474,7 +474,7 @@
     <w:p/>
     <w:p>
       <w:pPr>
-        <w:spacing w:after="60"/>
+        <w:spacing w:after="120"/>
       </w:pPr>
       <w:r>
         <w:rPr>
@@ -539,7 +539,7 @@
     <w:p/>
     <w:p>
       <w:pPr>
-        <w:spacing w:after="80"/>
+        <w:spacing w:after="120"/>
       </w:pPr>
       <w:r>
         <w:rPr>
@@ -552,7 +552,7 @@
     <w:p/>
     <w:p>
       <w:pPr>
-        <w:spacing w:after="60"/>
+        <w:spacing w:after="120"/>
       </w:pPr>
       <w:r>
         <w:rPr>
@@ -710,7 +710,7 @@
     <w:p/>
     <w:p>
       <w:pPr>
-        <w:spacing w:after="60"/>
+        <w:spacing w:after="120"/>
       </w:pPr>
       <w:r>
         <w:rPr>
@@ -792,7 +792,7 @@
     <w:p/>
     <w:p>
       <w:pPr>
-        <w:spacing w:after="80"/>
+        <w:spacing w:after="120"/>
       </w:pPr>
       <w:r>
         <w:rPr>
@@ -805,7 +805,7 @@
     <w:p/>
     <w:p>
       <w:pPr>
-        <w:spacing w:after="60"/>
+        <w:spacing w:after="120"/>
       </w:pPr>
       <w:r>
         <w:rPr>
@@ -863,7 +863,7 @@
     <w:p/>
     <w:p>
       <w:pPr>
-        <w:spacing w:after="60"/>
+        <w:spacing w:after="120"/>
       </w:pPr>
       <w:r>
         <w:rPr>
@@ -925,7 +925,7 @@
     <w:p/>
     <w:p>
       <w:pPr>
-        <w:spacing w:after="60"/>
+        <w:spacing w:after="120"/>
       </w:pPr>
       <w:r>
         <w:rPr>
@@ -1167,7 +1167,7 @@
     <w:p/>
     <w:p>
       <w:pPr>
-        <w:spacing w:after="60"/>
+        <w:spacing w:after="120"/>
       </w:pPr>
       <w:r>
         <w:rPr>
@@ -1214,7 +1214,7 @@
     <w:p/>
     <w:p>
       <w:pPr>
-        <w:spacing w:after="60"/>
+        <w:spacing w:after="120"/>
       </w:pPr>
       <w:r>
         <w:rPr>
@@ -1322,7 +1322,7 @@
     <w:p/>
     <w:p>
       <w:pPr>
-        <w:spacing w:after="60"/>
+        <w:spacing w:after="120"/>
       </w:pPr>
       <w:r>
         <w:rPr>
@@ -1408,7 +1408,7 @@
     <w:p/>
     <w:p>
       <w:pPr>
-        <w:spacing w:after="60"/>
+        <w:spacing w:after="120"/>
       </w:pPr>
       <w:r>
         <w:rPr>
@@ -1427,7 +1427,7 @@
     <w:p/>
     <w:p>
       <w:pPr>
-        <w:spacing w:after="60"/>
+        <w:spacing w:after="120"/>
       </w:pPr>
       <w:r>
         <w:rPr>
@@ -1507,7 +1507,7 @@
     <w:p/>
     <w:p>
       <w:pPr>
-        <w:spacing w:after="60"/>
+        <w:spacing w:after="120"/>
       </w:pPr>
       <w:r>
         <w:rPr>
@@ -1532,7 +1532,7 @@
     <w:p/>
     <w:p>
       <w:pPr>
-        <w:spacing w:after="80"/>
+        <w:spacing w:after="120"/>
       </w:pPr>
       <w:r>
         <w:rPr>
@@ -1599,7 +1599,7 @@
     <w:p/>
     <w:p>
       <w:pPr>
-        <w:spacing w:after="80"/>
+        <w:spacing w:after="120"/>
       </w:pPr>
       <w:r>
         <w:rPr>
@@ -1612,7 +1612,7 @@
     <w:p/>
     <w:p>
       <w:pPr>
-        <w:spacing w:after="60"/>
+        <w:spacing w:after="120"/>
       </w:pPr>
       <w:r>
         <w:rPr>
@@ -1680,7 +1680,7 @@
     <w:p/>
     <w:p>
       <w:pPr>
-        <w:spacing w:after="60"/>
+        <w:spacing w:after="120"/>
       </w:pPr>
       <w:r>
         <w:rPr>
@@ -1820,7 +1820,7 @@
     <w:p/>
     <w:p>
       <w:pPr>
-        <w:spacing w:after="60"/>
+        <w:spacing w:after="120"/>
       </w:pPr>
       <w:r>
         <w:rPr>
@@ -1915,7 +1915,7 @@
     <w:p/>
     <w:p>
       <w:pPr>
-        <w:spacing w:after="60"/>
+        <w:spacing w:after="120"/>
       </w:pPr>
       <w:r>
         <w:rPr>
@@ -2107,7 +2107,7 @@
     <w:p/>
     <w:p>
       <w:pPr>
-        <w:spacing w:after="60"/>
+        <w:spacing w:after="120"/>
       </w:pPr>
       <w:r>
         <w:rPr>
@@ -2298,7 +2298,7 @@
     <w:p/>
     <w:p>
       <w:pPr>
-        <w:spacing w:after="60"/>
+        <w:spacing w:after="120"/>
       </w:pPr>
       <w:r>
         <w:rPr>
@@ -2352,7 +2352,7 @@
     <w:p/>
     <w:p>
       <w:pPr>
-        <w:spacing w:after="60"/>
+        <w:spacing w:after="120"/>
       </w:pPr>
       <w:r>
         <w:rPr>
@@ -2528,7 +2528,7 @@
     <w:p/>
     <w:p>
       <w:pPr>
-        <w:spacing w:after="60"/>
+        <w:spacing w:after="120"/>
       </w:pPr>
       <w:r>
         <w:rPr>
@@ -2687,7 +2687,7 @@
     <w:p/>
     <w:p>
       <w:pPr>
-        <w:spacing w:after="80"/>
+        <w:spacing w:after="120"/>
       </w:pPr>
       <w:r>
         <w:rPr>
@@ -2700,7 +2700,7 @@
     <w:p/>
     <w:p>
       <w:pPr>
-        <w:spacing w:after="60"/>
+        <w:spacing w:after="120"/>
       </w:pPr>
       <w:r>
         <w:rPr>
@@ -2719,7 +2719,7 @@
     <w:p/>
     <w:p>
       <w:pPr>
-        <w:spacing w:after="60"/>
+        <w:spacing w:after="120"/>
       </w:pPr>
       <w:r>
         <w:rPr>
@@ -2832,7 +2832,7 @@
     <w:p/>
     <w:p>
       <w:pPr>
-        <w:spacing w:after="60"/>
+        <w:spacing w:after="120"/>
       </w:pPr>
       <w:r>
         <w:rPr>
@@ -2919,7 +2919,7 @@
     <w:p/>
     <w:p>
       <w:pPr>
-        <w:spacing w:after="60"/>
+        <w:spacing w:after="120"/>
       </w:pPr>
       <w:r>
         <w:rPr>
@@ -2954,7 +2954,7 @@
     <w:p/>
     <w:p>
       <w:pPr>
-        <w:spacing w:after="60"/>
+        <w:spacing w:after="120"/>
       </w:pPr>
       <w:r>
         <w:rPr>
@@ -3076,7 +3076,7 @@
     <w:p/>
     <w:p>
       <w:pPr>
-        <w:spacing w:after="80"/>
+        <w:spacing w:after="120"/>
       </w:pPr>
       <w:r>
         <w:rPr>
@@ -3095,7 +3095,7 @@
     <w:p/>
     <w:p>
       <w:pPr>
-        <w:spacing w:after="60"/>
+        <w:spacing w:after="120"/>
       </w:pPr>
       <w:r>
         <w:rPr>
@@ -3269,7 +3269,7 @@
     <w:p/>
     <w:p>
       <w:pPr>
-        <w:spacing w:after="60"/>
+        <w:spacing w:after="120"/>
       </w:pPr>
       <w:r>
         <w:rPr>
@@ -3416,7 +3416,7 @@
     <w:p/>
     <w:p>
       <w:pPr>
-        <w:spacing w:after="60"/>
+        <w:spacing w:after="120"/>
       </w:pPr>
       <w:r>
         <w:rPr>
@@ -3496,7 +3496,7 @@
     <w:p/>
     <w:p>
       <w:pPr>
-        <w:spacing w:after="60"/>
+        <w:spacing w:after="120"/>
       </w:pPr>
       <w:r>
         <w:rPr>
@@ -3621,7 +3621,7 @@
     <w:p/>
     <w:p>
       <w:pPr>
-        <w:spacing w:after="80"/>
+        <w:spacing w:after="120"/>
       </w:pPr>
       <w:r>
         <w:rPr>
@@ -3634,7 +3634,7 @@
     <w:p/>
     <w:p>
       <w:pPr>
-        <w:spacing w:after="60"/>
+        <w:spacing w:after="120"/>
       </w:pPr>
       <w:r>
         <w:rPr>
@@ -3673,7 +3673,7 @@
     <w:p/>
     <w:p>
       <w:pPr>
-        <w:spacing w:after="60"/>
+        <w:spacing w:after="120"/>
       </w:pPr>
       <w:r>
         <w:rPr>
@@ -3768,7 +3768,7 @@
     <w:p/>
     <w:p>
       <w:pPr>
-        <w:spacing w:after="60"/>
+        <w:spacing w:after="120"/>
       </w:pPr>
       <w:r>
         <w:rPr>
@@ -3917,7 +3917,7 @@
     <w:p/>
     <w:p>
       <w:pPr>
-        <w:spacing w:after="60"/>
+        <w:spacing w:after="120"/>
       </w:pPr>
       <w:r>
         <w:rPr>
@@ -3936,7 +3936,7 @@
     <w:p/>
     <w:p>
       <w:pPr>
-        <w:spacing w:after="60"/>
+        <w:spacing w:after="120"/>
       </w:pPr>
       <w:r>
         <w:rPr>
@@ -3961,7 +3961,7 @@
     <w:p/>
     <w:p>
       <w:pPr>
-        <w:spacing w:after="80"/>
+        <w:spacing w:after="120"/>
       </w:pPr>
       <w:r>
         <w:rPr>
@@ -4043,7 +4043,7 @@
     <w:p/>
     <w:p>
       <w:pPr>
-        <w:spacing w:after="60"/>
+        <w:spacing w:after="120"/>
       </w:pPr>
       <w:r>
         <w:rPr>
@@ -4171,7 +4171,7 @@
     <w:p/>
     <w:p>
       <w:pPr>
-        <w:spacing w:after="80"/>
+        <w:spacing w:after="120"/>
       </w:pPr>
       <w:r>
         <w:rPr>
@@ -4214,7 +4214,7 @@
     <w:p/>
     <w:p>
       <w:pPr>
-        <w:spacing w:after="80"/>
+        <w:spacing w:after="120"/>
       </w:pPr>
       <w:r>
         <w:rPr>
@@ -4284,7 +4284,7 @@
     <w:p/>
     <w:p>
       <w:pPr>
-        <w:spacing w:after="80"/>
+        <w:spacing w:after="120"/>
       </w:pPr>
       <w:r>
         <w:rPr>
@@ -4362,6 +4362,267 @@
     </w:p>
     <w:p/>
     <w:p>
+      <w:pPr>
+        <w:spacing w:after="120"/>
+      </w:pPr>
+      <w:r>
+        <w:rPr>
+          <w:b/>
+          <w:sz w:val="26"/>
+        </w:rPr>
+        <w:t>17. Diagramas incluidos</w:t>
+      </w:r>
+    </w:p>
+    <w:p/>
+    <w:p>
+      <w:pPr>
+        <w:spacing w:after="120"/>
+      </w:pPr>
+      <w:r>
+        <w:rPr>
+          <w:b/>
+          <w:sz w:val="22"/>
+        </w:rPr>
+        <w:t>Diagrama de clases</w:t>
+      </w:r>
+    </w:p>
+    <w:p/>
+    <w:p>
+      <w:r>
+        <w:drawing>
+          <wp:inline distT="0" distB="0" distL="0" distR="0">
+            <wp:extent cx="5900000" cy="3318750"/>
+            <wp:effectExtent l="0" t="0" r="0" b="0"/>
+            <wp:docPr id="1" name="Diagrama de clases"/>
+            <wp:cNvGraphicFramePr>
+              <a:graphicFrameLocks noChangeAspect="1"/>
+            </wp:cNvGraphicFramePr>
+            <a:graphic>
+              <a:graphicData uri="http://schemas.openxmlformats.org/drawingml/2006/picture">
+                <pic:pic>
+                  <pic:nvPicPr>
+                    <pic:cNvPr id="0" name="Diagrama de clases"/>
+                    <pic:cNvPicPr/>
+                  </pic:nvPicPr>
+                  <pic:blipFill>
+                    <a:blip r:embed="rId2"/>
+                    <a:stretch>
+                      <a:fillRect/>
+                    </a:stretch>
+                  </pic:blipFill>
+                  <pic:spPr>
+                    <a:xfrm>
+                      <a:off x="0" y="0"/>
+                      <a:ext cx="5900000" cy="3318750"/>
+                    </a:xfrm>
+                    <a:prstGeom prst="rect">
+                      <a:avLst/>
+                    </a:prstGeom>
+                  </pic:spPr>
+                </pic:pic>
+              </a:graphicData>
+            </a:graphic>
+          </wp:inline>
+        </w:drawing>
+      </w:r>
+    </w:p>
+    <w:p>
+      <w:r>
+        <w:rPr>
+          <w:i/>
+          <w:sz w:val="18"/>
+        </w:rPr>
+        <w:t>Diagrama de clases</w:t>
+      </w:r>
+    </w:p>
+    <w:p/>
+    <w:p>
+      <w:pPr>
+        <w:spacing w:after="120"/>
+      </w:pPr>
+      <w:r>
+        <w:rPr>
+          <w:b/>
+          <w:sz w:val="22"/>
+        </w:rPr>
+        <w:t>Modelo conceptual de base de datos</w:t>
+      </w:r>
+    </w:p>
+    <w:p/>
+    <w:p>
+      <w:r>
+        <w:drawing>
+          <wp:inline distT="0" distB="0" distL="0" distR="0">
+            <wp:extent cx="5900000" cy="3277778"/>
+            <wp:effectExtent l="0" t="0" r="0" b="0"/>
+            <wp:docPr id="1" name="Modelo conceptual"/>
+            <wp:cNvGraphicFramePr>
+              <a:graphicFrameLocks noChangeAspect="1"/>
+            </wp:cNvGraphicFramePr>
+            <a:graphic>
+              <a:graphicData uri="http://schemas.openxmlformats.org/drawingml/2006/picture">
+                <pic:pic>
+                  <pic:nvPicPr>
+                    <pic:cNvPr id="0" name="Modelo conceptual"/>
+                    <pic:cNvPicPr/>
+                  </pic:nvPicPr>
+                  <pic:blipFill>
+                    <a:blip r:embed="rId3"/>
+                    <a:stretch>
+                      <a:fillRect/>
+                    </a:stretch>
+                  </pic:blipFill>
+                  <pic:spPr>
+                    <a:xfrm>
+                      <a:off x="0" y="0"/>
+                      <a:ext cx="5900000" cy="3277778"/>
+                    </a:xfrm>
+                    <a:prstGeom prst="rect">
+                      <a:avLst/>
+                    </a:prstGeom>
+                  </pic:spPr>
+                </pic:pic>
+              </a:graphicData>
+            </a:graphic>
+          </wp:inline>
+        </w:drawing>
+      </w:r>
+    </w:p>
+    <w:p>
+      <w:r>
+        <w:rPr>
+          <w:i/>
+          <w:sz w:val="18"/>
+        </w:rPr>
+        <w:t>Modelo conceptual</w:t>
+      </w:r>
+    </w:p>
+    <w:p/>
+    <w:p>
+      <w:pPr>
+        <w:spacing w:after="120"/>
+      </w:pPr>
+      <w:r>
+        <w:rPr>
+          <w:b/>
+          <w:sz w:val="22"/>
+        </w:rPr>
+        <w:t>Modelo lógico de base de datos</w:t>
+      </w:r>
+    </w:p>
+    <w:p/>
+    <w:p>
+      <w:r>
+        <w:drawing>
+          <wp:inline distT="0" distB="0" distL="0" distR="0">
+            <wp:extent cx="5900000" cy="3933333"/>
+            <wp:effectExtent l="0" t="0" r="0" b="0"/>
+            <wp:docPr id="1" name="Modelo lógico"/>
+            <wp:cNvGraphicFramePr>
+              <a:graphicFrameLocks noChangeAspect="1"/>
+            </wp:cNvGraphicFramePr>
+            <a:graphic>
+              <a:graphicData uri="http://schemas.openxmlformats.org/drawingml/2006/picture">
+                <pic:pic>
+                  <pic:nvPicPr>
+                    <pic:cNvPr id="0" name="Modelo lógico"/>
+                    <pic:cNvPicPr/>
+                  </pic:nvPicPr>
+                  <pic:blipFill>
+                    <a:blip r:embed="rId4"/>
+                    <a:stretch>
+                      <a:fillRect/>
+                    </a:stretch>
+                  </pic:blipFill>
+                  <pic:spPr>
+                    <a:xfrm>
+                      <a:off x="0" y="0"/>
+                      <a:ext cx="5900000" cy="3933333"/>
+                    </a:xfrm>
+                    <a:prstGeom prst="rect">
+                      <a:avLst/>
+                    </a:prstGeom>
+                  </pic:spPr>
+                </pic:pic>
+              </a:graphicData>
+            </a:graphic>
+          </wp:inline>
+        </w:drawing>
+      </w:r>
+    </w:p>
+    <w:p>
+      <w:r>
+        <w:rPr>
+          <w:i/>
+          <w:sz w:val="18"/>
+        </w:rPr>
+        <w:t>Modelo lógico</w:t>
+      </w:r>
+    </w:p>
+    <w:p/>
+    <w:p>
+      <w:pPr>
+        <w:spacing w:after="120"/>
+      </w:pPr>
+      <w:r>
+        <w:rPr>
+          <w:b/>
+          <w:sz w:val="22"/>
+        </w:rPr>
+        <w:t>Modelo físico de base de datos</w:t>
+      </w:r>
+    </w:p>
+    <w:p/>
+    <w:p>
+      <w:r>
+        <w:drawing>
+          <wp:inline distT="0" distB="0" distL="0" distR="0">
+            <wp:extent cx="5900000" cy="3933333"/>
+            <wp:effectExtent l="0" t="0" r="0" b="0"/>
+            <wp:docPr id="1" name="Modelo físico"/>
+            <wp:cNvGraphicFramePr>
+              <a:graphicFrameLocks noChangeAspect="1"/>
+            </wp:cNvGraphicFramePr>
+            <a:graphic>
+              <a:graphicData uri="http://schemas.openxmlformats.org/drawingml/2006/picture">
+                <pic:pic>
+                  <pic:nvPicPr>
+                    <pic:cNvPr id="0" name="Modelo físico"/>
+                    <pic:cNvPicPr/>
+                  </pic:nvPicPr>
+                  <pic:blipFill>
+                    <a:blip r:embed="rId5"/>
+                    <a:stretch>
+                      <a:fillRect/>
+                    </a:stretch>
+                  </pic:blipFill>
+                  <pic:spPr>
+                    <a:xfrm>
+                      <a:off x="0" y="0"/>
+                      <a:ext cx="5900000" cy="3933333"/>
+                    </a:xfrm>
+                    <a:prstGeom prst="rect">
+                      <a:avLst/>
+                    </a:prstGeom>
+                  </pic:spPr>
+                </pic:pic>
+              </a:graphicData>
+            </a:graphic>
+          </wp:inline>
+        </w:drawing>
+      </w:r>
+    </w:p>
+    <w:p>
+      <w:r>
+        <w:rPr>
+          <w:i/>
+          <w:sz w:val="18"/>
+        </w:rPr>
+        <w:t>Modelo físico</w:t>
+      </w:r>
+    </w:p>
+    <w:p/>
+    <w:p>
       <w:r>
         <w:t xml:space="preserve">---</w:t>
       </w:r>
@@ -4369,7 +4630,7 @@
     <w:p/>
     <w:p>
       <w:pPr>
-        <w:spacing w:after="80"/>
+        <w:spacing w:after="120"/>
       </w:pPr>
       <w:r>
         <w:rPr>

</xml_diff>

<commit_message>
docs: agregar portada al documento Word del avance
</commit_message>
<xml_diff>
--- a/docs/AVANCE.docx
+++ b/docs/AVANCE.docx
@@ -2,6 +2,49 @@
 <file path=word/document.xml><?xml version="1.0" encoding="utf-8"?>
 <w:document xmlns:w="http://schemas.openxmlformats.org/wordprocessingml/2006/main" xmlns:r="http://schemas.openxmlformats.org/officeDocument/2006/relationships" xmlns:wp="http://schemas.openxmlformats.org/drawingml/2006/wordprocessingDrawing" xmlns:a="http://schemas.openxmlformats.org/drawingml/2006/main" xmlns:pic="http://schemas.openxmlformats.org/drawingml/2006/picture">
   <w:body>
+    <w:p>
+      <w:pPr>
+        <w:jc w:val="center"/>
+        <w:spacing w:after="120"/>
+      </w:pPr>
+      <w:r>
+        <w:rPr>
+          <w:b/>
+          <w:sz w:val="40"/>
+        </w:rPr>
+        <w:t>HuellaVet</w:t>
+      </w:r>
+    </w:p>
+    <w:p>
+      <w:pPr>
+        <w:jc w:val="center"/>
+        <w:spacing w:after="120"/>
+      </w:pPr>
+      <w:r>
+        <w:rPr>
+          <w:i/>
+          <w:sz w:val="22"/>
+        </w:rPr>
+        <w:t>Cuidamos</w:t>
+      </w:r>
+    </w:p>
+    <w:p>
+      <w:pPr>
+        <w:jc w:val="center"/>
+        <w:spacing w:after="120"/>
+      </w:pPr>
+      <w:r>
+        <w:rPr>
+          <w:sz w:val="20"/>
+        </w:rPr>
+        <w:t>Avance del proyecto final</w:t>
+      </w:r>
+    </w:p>
+    <w:p>
+      <w:r>
+        <w:br w:type="page"/>
+      </w:r>
+    </w:p>
     <w:p>
       <w:pPr>
         <w:spacing w:after="120"/>

</xml_diff>